<commit_message>
docs: update Word and TXT bug fixing reports to include only Nguyen's event fixes
</commit_message>
<xml_diff>
--- a/Bao_cao_Fix_Bugs_SEAL_Hackathon.docx
+++ b/Bao_cao_Fix_Bugs_SEAL_Hackathon.docx
@@ -12,9 +12,9 @@
           <w:rFonts w:ascii="Arial" w:hAnsi="Arial"/>
           <w:b/>
           <w:color w:val="1A365D"/>
-          <w:sz w:val="40"/>
+          <w:sz w:val="36"/>
         </w:rPr>
-        <w:t>BÁO CÁO KẾT QUẢ SỬA LỖI HỆ THỐNG (BUG FIXING)</w:t>
+        <w:t>BÁO CÁO KẾT QUẢ SỬA LỖI HỆ THỐNG - QUẢN LÝ SỰ KIỆN</w:t>
       </w:r>
     </w:p>
     <w:p>
@@ -29,7 +29,7 @@
           <w:color w:val="718096"/>
           <w:sz w:val="21"/>
         </w:rPr>
-        <w:t>Danh sách 10 lỗi kỹ thuật đã vá, nguyên nhân gốc rễ và giải pháp đồng bộ mã nguồn lên nhánh Nguyen_NK</w:t>
+        <w:t>Danh sách các lỗi kỹ thuật đã vá thuộc chức năng của Nguyên và giải pháp đồng bộ mã nguồn lên nhánh Nguyen_NK</w:t>
       </w:r>
     </w:p>
     <w:p>
@@ -48,7 +48,7 @@
         </w:rPr>
         <w:t>Kính gửi Nhóm phát triển,</w:t>
         <w:br/>
-        <w:t>Báo cáo này tổng hợp chi tiết nguyên nhân, giải pháp kỹ thuật và kết quả sửa đổi 10 lỗi nghiệp vụ được báo cáo bởi các thành viên trong đội (Tuấn, Huy, Nguyên, Bảo, Tú). Toàn bộ bản vá đã được đẩy thành công lên nhánh Nguyen_NK trên GitHub, hệ thống đã compile và chạy thử nghiệm ổn định 100%.</w:t>
+        <w:t>Báo cáo này tổng hợp chi tiết nguyên nhân, giải pháp kỹ thuật và kết quả sửa đổi các lỗi nghiệp vụ thuộc phần Quản lý Sự kiện (Event Management) được phụ trách bởi Nguyên. Toàn bộ bản vá đã được đẩy thành công lên nhánh Nguyen_NK trên GitHub, hệ thống đã compile và chạy thử nghiệm ổn định 100%.</w:t>
       </w:r>
     </w:p>
     <w:p>
@@ -63,7 +63,7 @@
           <w:color w:val="1A365D"/>
           <w:sz w:val="32"/>
         </w:rPr>
-        <w:t>PHẦN I: TỔNG HỢP DANH SÁCH 10 LỖI VÀ TRẠNG THÁI SỬA CHỮA</w:t>
+        <w:t>PHẦN I: TỔNG HỢP DANH SÁCH LỖI VÀ TRẠNG THÁI SỬA CHỮA</w:t>
       </w:r>
     </w:p>
     <w:tbl>
@@ -115,7 +115,7 @@
           </w:tcPr>
           <w:p>
             <w:r>
-              <w:t>Trạng Thế</w:t>
+              <w:t>Trạng Thái</w:t>
             </w:r>
           </w:p>
         </w:tc>
@@ -128,90 +128,6 @@
           <w:p>
             <w:r>
               <w:t>1</w:t>
-            </w:r>
-          </w:p>
-        </w:tc>
-        <w:tc>
-          <w:tcPr>
-            <w:tcW w:type="dxa" w:w="2340"/>
-          </w:tcPr>
-          <w:p>
-            <w:r>
-              <w:t>Failed to fetch mentorship request (Tuấn)</w:t>
-            </w:r>
-          </w:p>
-        </w:tc>
-        <w:tc>
-          <w:tcPr>
-            <w:tcW w:type="dxa" w:w="2340"/>
-          </w:tcPr>
-          <w:p>
-            <w:r>
-              <w:t>Lỗi 404 khi thí sinh chưa gia nhập đội thi nào</w:t>
-            </w:r>
-          </w:p>
-        </w:tc>
-        <w:tc>
-          <w:tcPr>
-            <w:tcW w:type="dxa" w:w="2340"/>
-          </w:tcPr>
-          <w:p>
-            <w:r>
-              <w:t>ĐÃ SỬA &amp; PUSHED</w:t>
-            </w:r>
-          </w:p>
-        </w:tc>
-      </w:tr>
-      <w:tr>
-        <w:tc>
-          <w:tcPr>
-            <w:tcW w:type="dxa" w:w="2340"/>
-          </w:tcPr>
-          <w:p>
-            <w:r>
-              <w:t>2</w:t>
-            </w:r>
-          </w:p>
-        </w:tc>
-        <w:tc>
-          <w:tcPr>
-            <w:tcW w:type="dxa" w:w="2340"/>
-          </w:tcPr>
-          <w:p>
-            <w:r>
-              <w:t>Thiếu hiển thị User pending (Huy)</w:t>
-            </w:r>
-          </w:p>
-        </w:tc>
-        <w:tc>
-          <w:tcPr>
-            <w:tcW w:type="dxa" w:w="2340"/>
-          </w:tcPr>
-          <w:p>
-            <w:r>
-              <w:t>Gán sai kiểu đối tượng Page Spring Boot vào state mảng</w:t>
-            </w:r>
-          </w:p>
-        </w:tc>
-        <w:tc>
-          <w:tcPr>
-            <w:tcW w:type="dxa" w:w="2340"/>
-          </w:tcPr>
-          <w:p>
-            <w:r>
-              <w:t>ĐÃ SỬA &amp; PUSHED</w:t>
-            </w:r>
-          </w:p>
-        </w:tc>
-      </w:tr>
-      <w:tr>
-        <w:tc>
-          <w:tcPr>
-            <w:tcW w:type="dxa" w:w="2340"/>
-          </w:tcPr>
-          <w:p>
-            <w:r>
-              <w:t>3</w:t>
             </w:r>
           </w:p>
         </w:tc>
@@ -253,7 +169,7 @@
           </w:tcPr>
           <w:p>
             <w:r>
-              <w:t>4</w:t>
+              <w:t>2</w:t>
             </w:r>
           </w:p>
         </w:tc>
@@ -295,7 +211,7 @@
           </w:tcPr>
           <w:p>
             <w:r>
-              <w:t>5</w:t>
+              <w:t>3</w:t>
             </w:r>
           </w:p>
         </w:tc>
@@ -337,7 +253,7 @@
           </w:tcPr>
           <w:p>
             <w:r>
-              <w:t>6</w:t>
+              <w:t>4</w:t>
             </w:r>
           </w:p>
         </w:tc>
@@ -357,7 +273,7 @@
           </w:tcPr>
           <w:p>
             <w:r>
-              <w:t>Bị chặn bởi lỗi NullPointerException ở mục số 4</w:t>
+              <w:t>Bị chặn bởi lỗi NullPointerException ở mục số 2</w:t>
             </w:r>
           </w:p>
         </w:tc>
@@ -379,7 +295,7 @@
           </w:tcPr>
           <w:p>
             <w:r>
-              <w:t>7</w:t>
+              <w:t>5</w:t>
             </w:r>
           </w:p>
         </w:tc>
@@ -399,7 +315,7 @@
           </w:tcPr>
           <w:p>
             <w:r>
-              <w:t>Bị chặn bởi lỗi NullPointerException ở mục số 4</w:t>
+              <w:t>Bị chặn bởi lỗi NullPointerException ở mục số 2</w:t>
             </w:r>
           </w:p>
         </w:tc>
@@ -421,7 +337,7 @@
           </w:tcPr>
           <w:p>
             <w:r>
-              <w:t>8</w:t>
+              <w:t>6</w:t>
             </w:r>
           </w:p>
         </w:tc>
@@ -456,90 +372,6 @@
           </w:p>
         </w:tc>
       </w:tr>
-      <w:tr>
-        <w:tc>
-          <w:tcPr>
-            <w:tcW w:type="dxa" w:w="2340"/>
-          </w:tcPr>
-          <w:p>
-            <w:r>
-              <w:t>9</w:t>
-            </w:r>
-          </w:p>
-        </w:tc>
-        <w:tc>
-          <w:tcPr>
-            <w:tcW w:type="dxa" w:w="2340"/>
-          </w:tcPr>
-          <w:p>
-            <w:r>
-              <w:t>Không chấm bài thi được (Bảo)</w:t>
-            </w:r>
-          </w:p>
-        </w:tc>
-        <w:tc>
-          <w:tcPr>
-            <w:tcW w:type="dxa" w:w="2340"/>
-          </w:tcPr>
-          <w:p>
-            <w:r>
-              <w:t>Hardcode event ID = 1 và ràng buộc cứng điểm số @Min(1)/@Max(10)</w:t>
-            </w:r>
-          </w:p>
-        </w:tc>
-        <w:tc>
-          <w:tcPr>
-            <w:tcW w:type="dxa" w:w="2340"/>
-          </w:tcPr>
-          <w:p>
-            <w:r>
-              <w:t>ĐÃ SỬA &amp; PUSHED</w:t>
-            </w:r>
-          </w:p>
-        </w:tc>
-      </w:tr>
-      <w:tr>
-        <w:tc>
-          <w:tcPr>
-            <w:tcW w:type="dxa" w:w="2340"/>
-          </w:tcPr>
-          <w:p>
-            <w:r>
-              <w:t>10</w:t>
-            </w:r>
-          </w:p>
-        </w:tc>
-        <w:tc>
-          <w:tcPr>
-            <w:tcW w:type="dxa" w:w="2340"/>
-          </w:tcPr>
-          <w:p>
-            <w:r>
-              <w:t>Chưa tạo được team (Tú)</w:t>
-            </w:r>
-          </w:p>
-        </w:tc>
-        <w:tc>
-          <w:tcPr>
-            <w:tcW w:type="dxa" w:w="2340"/>
-          </w:tcPr>
-          <w:p>
-            <w:r>
-              <w:t>Cần cập nhật đầy đủ Họ tên và SĐT trong Profile trước khi tham gia</w:t>
-            </w:r>
-          </w:p>
-        </w:tc>
-        <w:tc>
-          <w:tcPr>
-            <w:tcW w:type="dxa" w:w="2340"/>
-          </w:tcPr>
-          <w:p>
-            <w:r>
-              <w:t>HƯỚNG DẪN Xong</w:t>
-            </w:r>
-          </w:p>
-        </w:tc>
-      </w:tr>
     </w:tbl>
     <w:p>
       <w:pPr>
@@ -567,67 +399,7 @@
           <w:color w:val="2B6CB0"/>
           <w:sz w:val="22"/>
         </w:rPr>
-        <w:t>1. Lỗi Mentorship Request List (Tuấn)</w:t>
-      </w:r>
-    </w:p>
-    <w:p>
-      <w:pPr>
-        <w:spacing w:after="120"/>
-        <w:ind w:left="240"/>
-      </w:pPr>
-      <w:r>
-        <w:rPr>
-          <w:rFonts w:ascii="Arial" w:hAnsi="Arial"/>
-          <w:color w:val="2D3748"/>
-          <w:sz w:val="19"/>
-        </w:rPr>
-        <w:t>File sửa: MentorshipRequestServiceImpl.java</w:t>
-        <w:br/>
-        <w:t>Phương án: Thay vì ném ResourceNotFoundException (404), hàm getMyMentorshipRequests trả về List.of() (danh sách rỗng) để Frontend nhận dạng bình thường và hiển thị bảng tin rỗng.</w:t>
-      </w:r>
-    </w:p>
-    <w:p>
-      <w:pPr>
-        <w:spacing w:before="160" w:after="40"/>
-      </w:pPr>
-      <w:r>
-        <w:rPr>
-          <w:rFonts w:ascii="Arial" w:hAnsi="Arial"/>
-          <w:b/>
-          <w:color w:val="2B6CB0"/>
-          <w:sz w:val="22"/>
-        </w:rPr>
-        <w:t>2. Lỗi Pending Users Approvals (Huy)</w:t>
-      </w:r>
-    </w:p>
-    <w:p>
-      <w:pPr>
-        <w:spacing w:after="120"/>
-        <w:ind w:left="240"/>
-      </w:pPr>
-      <w:r>
-        <w:rPr>
-          <w:rFonts w:ascii="Arial" w:hAnsi="Arial"/>
-          <w:color w:val="2D3748"/>
-          <w:sz w:val="19"/>
-        </w:rPr>
-        <w:t>File sửa: AdminPendingApprovalsPage.tsx</w:t>
-        <w:br/>
-        <w:t>Phương án: Chỉnh sửa hàm fetchPendingUsers để kiểm tra xem API trả về mảng trực tiếp hay đối tượng Page (chứa thuộc tính content) rồi thực hiện gán state setUsers(responseData.content || responseData) một cách an toàn.</w:t>
-      </w:r>
-    </w:p>
-    <w:p>
-      <w:pPr>
-        <w:spacing w:before="160" w:after="40"/>
-      </w:pPr>
-      <w:r>
-        <w:rPr>
-          <w:rFonts w:ascii="Arial" w:hAnsi="Arial"/>
-          <w:b/>
-          <w:color w:val="2B6CB0"/>
-          <w:sz w:val="22"/>
-        </w:rPr>
-        <w:t>3 &amp; 5. Lỗi tạo/sửa event ngày tháng chuỗi rỗng (Nguyên)</w:t>
+        <w:t>1 &amp; 3. Lỗi tạo/sửa event ngày tháng chuỗi rỗng (Nguyên)</w:t>
       </w:r>
     </w:p>
     <w:p>
@@ -643,7 +415,7 @@
         </w:rPr>
         <w:t>File sửa: HackathonEventService.ts</w:t>
         <w:br/>
-        <w:t>Phương án: Cập nhật hàm tạo và cập nhật event để kiểm tra nếu các trường ngày tháng là chuỗi rỗng "" thì tự động chuyển thành null trước khi POST/PUT lên Backend.</w:t>
+        <w:t>Phương án: Cập nhật hàm tạo và cập nhật event để kiểm tra nếu các trường ngày tháng là chuỗi rỗng "" thì tự động chuyển thành null trước khi POST/PUT lên Backend. Điều này tránh việc thư viện Jackson của Spring Boot ném lỗi 400 Bad Request.</w:t>
       </w:r>
     </w:p>
     <w:p>
@@ -657,7 +429,7 @@
           <w:color w:val="2B6CB0"/>
           <w:sz w:val="22"/>
         </w:rPr>
-        <w:t>4, 6, 7 &amp; 8. Lỗi NullPointerException của Organizer &amp; Luồng Event (Nguyên)</w:t>
+        <w:t>2, 4, 5 &amp; 6. Lỗi NullPointerException của Organizer &amp; Luồng Event (Nguyên)</w:t>
       </w:r>
     </w:p>
     <w:p>
@@ -674,68 +446,6 @@
         <w:t>File sửa: HackathonEventServiceImpl.java</w:t>
         <w:br/>
         <w:t>Phương án: Sửa hàm requireOrganizerOrAdmin để thêm kiểm tra null check cho Organizer. Việc này ngay lập tức vá được lỗi NPE và giúp các nút Delete, Complete và Publish hoạt động hoàn toàn bình thường.</w:t>
-      </w:r>
-    </w:p>
-    <w:p>
-      <w:pPr>
-        <w:spacing w:before="160" w:after="40"/>
-      </w:pPr>
-      <w:r>
-        <w:rPr>
-          <w:rFonts w:ascii="Arial" w:hAnsi="Arial"/>
-          <w:b/>
-          <w:color w:val="2B6CB0"/>
-          <w:sz w:val="22"/>
-        </w:rPr>
-        <w:t>9. Lỗi chấm điểm thi (Bảo)</w:t>
-      </w:r>
-    </w:p>
-    <w:p>
-      <w:pPr>
-        <w:spacing w:after="120"/>
-        <w:ind w:left="240"/>
-      </w:pPr>
-      <w:r>
-        <w:rPr>
-          <w:rFonts w:ascii="Arial" w:hAnsi="Arial"/>
-          <w:color w:val="2D3748"/>
-          <w:sz w:val="19"/>
-        </w:rPr>
-        <w:t>File sửa: ScoringPage.tsx &amp; CreateScoreRequest.java</w:t>
-        <w:br/>
-        <w:t>Phương án:</w:t>
-        <w:br/>
-        <w:t>- Thay thế API hardcode '/criteria/event/1' bằng Event ID động từ bài nộp: '/criteria/event/' + submissionData.eventId.</w:t>
-        <w:br/>
-        <w:t>- Xóa bỏ các annotation kiểm tra cứng @Min(1) và @Max(10) trong CreateScoreRequest.java để cho phép thang điểm tùy biến (ví dụ: tối đa 20, 30 điểm) và chấm điểm 0.</w:t>
-      </w:r>
-    </w:p>
-    <w:p>
-      <w:pPr>
-        <w:spacing w:before="160" w:after="40"/>
-      </w:pPr>
-      <w:r>
-        <w:rPr>
-          <w:rFonts w:ascii="Arial" w:hAnsi="Arial"/>
-          <w:b/>
-          <w:color w:val="2B6CB0"/>
-          <w:sz w:val="22"/>
-        </w:rPr>
-        <w:t>10. Lỗi không tạo được nhóm (Tú)</w:t>
-      </w:r>
-    </w:p>
-    <w:p>
-      <w:pPr>
-        <w:spacing w:after="120"/>
-        <w:ind w:left="240"/>
-      </w:pPr>
-      <w:r>
-        <w:rPr>
-          <w:rFonts w:ascii="Arial" w:hAnsi="Arial"/>
-          <w:color w:val="2D3748"/>
-          <w:sz w:val="19"/>
-        </w:rPr>
-        <w:t>Giải pháp: Đây là quy tắc bắt buộc của hệ thống (isProfileComplete() kiểm tra fullName và phone). Đã bổ sung cơ chế hiển thị lỗi rõ ràng trên Toast để hướng dẫn thí sinh truy cập trang Profile/Settings điền đầy đủ Họ tên và SĐT trước khi bấm tạo nhóm.</w:t>
       </w:r>
     </w:p>
     <w:p>

</xml_diff>